<commit_message>
feat: refresh portfolio projects and developer profile
</commit_message>
<xml_diff>
--- a/cv/Trung_Hieu_Dinh_CV.docx
+++ b/cv/Trung_Hieu_Dinh_CV.docx
@@ -121,7 +121,7 @@
           <w:sz w:val="19"/>
           <w:u w:val="none"/>
         </w:rPr>
-        <w:t>Web &amp; Mobile Developer | Fullstack Developer</w:t>
+        <w:t>Fullstack Web Developer | Sub-leader</w:t>
       </w:r>
     </w:p>
     <w:p>
@@ -241,7 +241,7 @@
           <w:sz w:val="20"/>
           <w:u w:val="none"/>
         </w:rPr>
-        <w:t>Web Systems Developer</w:t>
+        <w:t>Web Systems Developer · Sub-leader</w:t>
       </w:r>
       <w:r>
         <w:rPr>
@@ -302,7 +302,7 @@
           <w:sz w:val="18"/>
           <w:u w:val="none"/>
         </w:rPr>
-        <w:t>Led migration of legacy Java/NetBeans desktop gas management systems into modern web-based platforms, improving maintainability and browser-based access for internal users.</w:t>
+        <w:t>Promoted to Sub-leader in July 2026 while continuing hands-on web systems development and delivery.</w:t>
       </w:r>
     </w:p>
     <w:p>
@@ -320,7 +320,7 @@
           <w:sz w:val="18"/>
           <w:u w:val="none"/>
         </w:rPr>
-        <w:t>Architected and delivered internal web management systems for Japanese manufacturing and enterprise workflows, covering asset tracking, operations, and reporting dashboards.</w:t>
+        <w:t>Led migration of legacy Java/NetBeans gas management systems into maintainable browser-based platforms.</w:t>
       </w:r>
     </w:p>
     <w:p>
@@ -338,7 +338,7 @@
           <w:sz w:val="18"/>
           <w:u w:val="none"/>
         </w:rPr>
-        <w:t>Converted complex native workflows into responsive web interfaces while preserving business rules, data entry patterns, and real-time operational requirements.</w:t>
+        <w:t>Architected and delivered internal systems for Japanese manufacturing and enterprise workflows, including asset tracking, operations, and reporting dashboards.</w:t>
       </w:r>
     </w:p>
     <w:p>
@@ -418,7 +418,7 @@
           <w:sz w:val="18"/>
           <w:u w:val="none"/>
         </w:rPr>
-        <w:t>Built and shipped 20+ production projects across Vietnam, Japan, the US, and Australia, including e-commerce stores, booking platforms, POS systems, B2B portals, and automation tools.</w:t>
+        <w:t>Built and shipped 20+ projects across Vietnam, Japan, the US, and Australia, including Rema Pilates, booking platforms, e-commerce, POS, B2B portals, and developer tools.</w:t>
       </w:r>
     </w:p>
     <w:p>
@@ -436,7 +436,7 @@
           <w:sz w:val="18"/>
           <w:u w:val="none"/>
         </w:rPr>
-        <w:t>Owned end-to-end delivery across Laravel/PHP, MySQL, Blade, Vanilla JavaScript/CSS, payment integrations, CMS, admin dashboards, hosting, deployment, and client handoff.</w:t>
+        <w:t>Owned end-to-end delivery across requirements, architecture, Laravel/PHP, MySQL, Blade/JavaScript, payments, CMS/admin systems, testing, deployment, and production hardening.</w:t>
       </w:r>
     </w:p>
     <w:p>
@@ -454,7 +454,7 @@
           <w:sz w:val="18"/>
           <w:u w:val="none"/>
         </w:rPr>
-        <w:t>Implemented business-critical flows such as checkout, voucher validation, staff scheduling, QR ordering, order management, real-time notifications, and SEO/content management.</w:t>
+        <w:t>Implemented business-critical booking, resource scheduling, checkout, payment reconciliation, notification, reporting, RBAC, and automation workflows.</w:t>
       </w:r>
     </w:p>
     <w:p>
@@ -703,6 +703,69 @@
           <w:sz w:val="19"/>
           <w:u w:val="none"/>
         </w:rPr>
+        <w:t>Rema Pilates</w:t>
+      </w:r>
+      <w:r>
+        <w:rPr>
+          <w:rFonts w:ascii="Arial" w:hAnsi="Arial"/>
+          <w:b w:val="0"/>
+          <w:i/>
+          <w:color w:val="000080"/>
+          <w:sz w:val="19"/>
+          <w:u w:val="none"/>
+        </w:rPr>
+        <w:t xml:space="preserve"> | Laravel 13, PHP 8.4, MySQL, SePay, TTLock</w:t>
+      </w:r>
+    </w:p>
+    <w:p>
+      <w:pPr>
+        <w:pStyle w:val="ListBullet"/>
+        <w:spacing w:after="0" w:line="240" w:lineRule="auto"/>
+        <w:ind w:left="547" w:hanging="259"/>
+      </w:pPr>
+      <w:r>
+        <w:rPr>
+          <w:rFonts w:ascii="Arial" w:hAnsi="Arial"/>
+          <w:b w:val="0"/>
+          <w:i w:val="0"/>
+          <w:color w:val="000000"/>
+          <w:sz w:val="17"/>
+          <w:u w:val="none"/>
+        </w:rPr>
+        <w:t>Delivered the official bilingual marketing, booking, and studio operations platform at remapilates.com, covering scheduling, events, customer accounts, CRM, CMS, payments, refunds, reports, and RBAC.</w:t>
+      </w:r>
+    </w:p>
+    <w:p>
+      <w:pPr>
+        <w:pStyle w:val="ListBullet"/>
+        <w:spacing w:after="0" w:line="240" w:lineRule="auto"/>
+        <w:ind w:left="547" w:hanging="259"/>
+      </w:pPr>
+      <w:r>
+        <w:rPr>
+          <w:rFonts w:ascii="Arial" w:hAnsi="Arial"/>
+          <w:b w:val="0"/>
+          <w:i w:val="0"/>
+          <w:color w:val="000000"/>
+          <w:sz w:val="17"/>
+          <w:u w:val="none"/>
+        </w:rPr>
+        <w:t>Implemented transactional resource locking, idempotent SePay settlement, automated lifecycle jobs, production deployment tooling, and TTLock smart-access workflows.</w:t>
+      </w:r>
+    </w:p>
+    <w:p>
+      <w:pPr>
+        <w:spacing w:before="80" w:after="0"/>
+      </w:pPr>
+      <w:r>
+        <w:rPr>
+          <w:rFonts w:ascii="Arial" w:hAnsi="Arial"/>
+          <w:b/>
+          <w:i w:val="0"/>
+          <w:color w:val="000080"/>
+          <w:sz w:val="19"/>
+          <w:u w:val="none"/>
+        </w:rPr>
         <w:t>Candle Shop</w:t>
       </w:r>
       <w:r>
@@ -732,7 +795,7 @@
           <w:sz w:val="17"/>
           <w:u w:val="none"/>
         </w:rPr>
-        <w:t>Built a full e-commerce platform with bilingual storefront, cart, checkout, Stripe payment, voucher system, order management, SEO/content settings, reviews, and admin dashboard.</w:t>
+        <w:t>Built a bilingual e-commerce platform with cart, checkout, Stripe payment, vouchers, order management, SEO/content settings, reviews, and admin dashboard.</w:t>
       </w:r>
     </w:p>
     <w:p>
@@ -750,7 +813,7 @@
           <w:sz w:val="17"/>
           <w:u w:val="none"/>
         </w:rPr>
-        <w:t>Implemented two-phase checkout, server-side voucher validation, dynamic shipping fees, invoice PDFs, and real-time Telegram/WebSocket notifications to reduce payment and stock inconsistencies.</w:t>
+        <w:t>Implemented two-phase checkout, server-side voucher validation, dynamic shipping fees, invoice PDFs, and real-time Telegram/WebSocket notifications.</w:t>
       </w:r>
     </w:p>
     <w:p>
@@ -795,7 +858,7 @@
           <w:sz w:val="17"/>
           <w:u w:val="none"/>
         </w:rPr>
-        <w:t>Built a mobile-first white-label booking platform for US nail salons with a 5-step booking wizard, service/staff selection, customer CRM, gallery, reviews, technician profiles, and CMS.</w:t>
+        <w:t>Built a mobile-first white-label booking platform for US nail salons with a 5-step wizard, staff selection, customer CRM, gallery, reviews, technician profiles, and CMS.</w:t>
       </w:r>
     </w:p>
     <w:p>
@@ -813,70 +876,7 @@
           <w:sz w:val="17"/>
           <w:u w:val="none"/>
         </w:rPr>
-        <w:t>Designed slot-availability logic for sequential multi-service appointments across different staff schedules, including transactional conflict checks and reminder automation.</w:t>
-      </w:r>
-    </w:p>
-    <w:p>
-      <w:pPr>
-        <w:spacing w:before="80" w:after="0"/>
-      </w:pPr>
-      <w:r>
-        <w:rPr>
-          <w:rFonts w:ascii="Arial" w:hAnsi="Arial"/>
-          <w:b/>
-          <w:i w:val="0"/>
-          <w:color w:val="000080"/>
-          <w:sz w:val="19"/>
-          <w:u w:val="none"/>
-        </w:rPr>
-        <w:t>ProPOS - Fastfood POS</w:t>
-      </w:r>
-      <w:r>
-        <w:rPr>
-          <w:rFonts w:ascii="Arial" w:hAnsi="Arial"/>
-          <w:b w:val="0"/>
-          <w:i/>
-          <w:color w:val="000080"/>
-          <w:sz w:val="19"/>
-          <w:u w:val="none"/>
-        </w:rPr>
-        <w:t xml:space="preserve"> | Laravel, MySQL, QR Code, KDS, Vanilla JS</w:t>
-      </w:r>
-    </w:p>
-    <w:p>
-      <w:pPr>
-        <w:pStyle w:val="ListBullet"/>
-        <w:spacing w:after="0" w:line="240" w:lineRule="auto"/>
-        <w:ind w:left="547" w:hanging="259"/>
-      </w:pPr>
-      <w:r>
-        <w:rPr>
-          <w:rFonts w:ascii="Arial" w:hAnsi="Arial"/>
-          <w:b w:val="0"/>
-          <w:i w:val="0"/>
-          <w:color w:val="000000"/>
-          <w:sz w:val="17"/>
-          <w:u w:val="none"/>
-        </w:rPr>
-        <w:t>Built a QR-based restaurant POS with customer ordering, staff portal, table map, Kitchen Display System, owner dashboard, menu/table/staff CRUD, tax/service settings, and revenue reports.</w:t>
-      </w:r>
-    </w:p>
-    <w:p>
-      <w:pPr>
-        <w:pStyle w:val="ListBullet"/>
-        <w:spacing w:after="0" w:line="240" w:lineRule="auto"/>
-        <w:ind w:left="547" w:hanging="259"/>
-      </w:pPr>
-      <w:r>
-        <w:rPr>
-          <w:rFonts w:ascii="Arial" w:hAnsi="Arial"/>
-          <w:b w:val="0"/>
-          <w:i w:val="0"/>
-          <w:color w:val="000000"/>
-          <w:sz w:val="17"/>
-          <w:u w:val="none"/>
-        </w:rPr>
-        <w:t>Implemented role-based portals and QR table sessions so customer orders, kitchen tickets, and owner reports stay synchronized without requiring app installation.</w:t>
+        <w:t>Designed slot availability for sequential multi-service appointments across staff schedules with transactional conflict checks and reminder automation.</w:t>
       </w:r>
     </w:p>
     <w:p>
@@ -937,7 +937,7 @@
           <w:sz w:val="19"/>
           <w:u w:val="none"/>
         </w:rPr>
-        <w:t>Memory Challenge</w:t>
+        <w:t>Hyper Video Tool</w:t>
       </w:r>
       <w:r>
         <w:rPr>
@@ -948,7 +948,7 @@
           <w:sz w:val="19"/>
           <w:u w:val="none"/>
         </w:rPr>
-        <w:t xml:space="preserve"> | Android Java, SQLite, XML UI, Material Components</w:t>
+        <w:t xml:space="preserve"> | Node.js, SQLite, HyperFrames, FFmpeg, Edge TTS</w:t>
       </w:r>
     </w:p>
     <w:p>
@@ -966,7 +966,7 @@
           <w:sz w:val="17"/>
           <w:u w:val="none"/>
         </w:rPr>
-        <w:t>Built a native Android memory game with timed multi-level gameplay, score bonuses, ranking, player setup, custom animations, sound/vibration settings, and multilingual UI.</w:t>
+        <w:t>Built a local-first tool for managing video projects, briefs, assets, scenes, templates, voiceover, preview, asynchronous MP4 rendering, snapshots, and output history.</w:t>
       </w:r>
     </w:p>
     <w:p>
@@ -1028,7 +1028,7 @@
           <w:sz w:val="18"/>
           <w:u w:val="none"/>
         </w:rPr>
-        <w:t xml:space="preserve">Backend: </w:t>
+        <w:t xml:space="preserve">Backend &amp; Delivery: </w:t>
       </w:r>
       <w:r>
         <w:rPr>
@@ -1039,7 +1039,7 @@
           <w:sz w:val="18"/>
           <w:u w:val="none"/>
         </w:rPr>
-        <w:t>Laravel, PHP, Node.js, FastAPI, MySQL, MongoDB, Firebase, REST APIs, authentication, admin dashboards</w:t>
+        <w:t>Laravel, PHP, Node.js, FastAPI, MySQL, SQLite, REST APIs, Docker, Linux/Nginx, GitHub Actions</w:t>
       </w:r>
     </w:p>
     <w:p>
@@ -1055,7 +1055,7 @@
           <w:sz w:val="18"/>
           <w:u w:val="none"/>
         </w:rPr>
-        <w:t xml:space="preserve">Mobile: </w:t>
+        <w:t xml:space="preserve">Mobile &amp; Integrations: </w:t>
       </w:r>
       <w:r>
         <w:rPr>
@@ -1066,96 +1066,7 @@
           <w:sz w:val="18"/>
           <w:u w:val="none"/>
         </w:rPr>
-        <w:t>Android Java, iOS Swift, Flutter, Android XML, SQLite, SharedPreferences</w:t>
-      </w:r>
-    </w:p>
-    <w:p>
-      <w:pPr>
-        <w:spacing w:after="0"/>
-      </w:pPr>
-      <w:r>
-        <w:rPr>
-          <w:rFonts w:ascii="Arial" w:hAnsi="Arial"/>
-          <w:b/>
-          <w:i w:val="0"/>
-          <w:color w:val="000000"/>
-          <w:sz w:val="18"/>
-          <w:u w:val="none"/>
-        </w:rPr>
-        <w:t xml:space="preserve">Integrations: </w:t>
-      </w:r>
-      <w:r>
-        <w:rPr>
-          <w:rFonts w:ascii="Arial" w:hAnsi="Arial"/>
-          <w:b w:val="0"/>
-          <w:i w:val="0"/>
-          <w:color w:val="000000"/>
-          <w:sz w:val="18"/>
-          <w:u w:val="none"/>
-        </w:rPr>
-        <w:t>Stripe, Telegram Bot API, Google APIs, WebSocket/Reverb, email/PDF generation</w:t>
-      </w:r>
-    </w:p>
-    <w:p>
-      <w:pPr>
-        <w:spacing w:after="0"/>
-      </w:pPr>
-      <w:r>
-        <w:rPr>
-          <w:rFonts w:ascii="Arial" w:hAnsi="Arial"/>
-          <w:b/>
-          <w:i w:val="0"/>
-          <w:color w:val="000000"/>
-          <w:sz w:val="18"/>
-          <w:u w:val="none"/>
-        </w:rPr>
-        <w:t xml:space="preserve">Tools &amp; Other: </w:t>
-      </w:r>
-      <w:r>
-        <w:rPr>
-          <w:rFonts w:ascii="Arial" w:hAnsi="Arial"/>
-          <w:b w:val="0"/>
-          <w:i w:val="0"/>
-          <w:color w:val="000000"/>
-          <w:sz w:val="18"/>
-          <w:u w:val="none"/>
-        </w:rPr>
-        <w:t>Git, Vite, Axios, Hostinger deployment, Chart.js, GSAP, Splide.js, Swiper.js</w:t>
-      </w:r>
-    </w:p>
-    <w:p>
-      <w:pPr>
-        <w:spacing w:before="60" w:after="40"/>
-        <w:pBdr>
-          <w:bottom w:val="single" w:sz="6" w:space="1" w:color="808080"/>
-        </w:pBdr>
-      </w:pPr>
-      <w:r>
-        <w:rPr>
-          <w:rFonts w:ascii="Arial" w:hAnsi="Arial"/>
-          <w:b/>
-          <w:i w:val="0"/>
-          <w:color w:val="000000"/>
-          <w:sz w:val="23"/>
-          <w:u w:val="none"/>
-        </w:rPr>
-        <w:t>Highlights</w:t>
-      </w:r>
-    </w:p>
-    <w:p>
-      <w:pPr>
-        <w:spacing w:after="0"/>
-      </w:pPr>
-      <w:r>
-        <w:rPr>
-          <w:rFonts w:ascii="Arial" w:hAnsi="Arial"/>
-          <w:b w:val="0"/>
-          <w:i w:val="0"/>
-          <w:color w:val="000000"/>
-          <w:sz w:val="18"/>
-          <w:u w:val="none"/>
-        </w:rPr>
-        <w:t>5+ years of experience | 20+ shipped projects | 15+ technologies used | Fullstack web, mobile, admin systems, booking, POS, e-commerce, and automation</w:t>
+        <w:t>Android Java, iOS Swift, Flutter, Stripe, SePay, TTLock, WebSockets, FFmpeg</w:t>
       </w:r>
     </w:p>
     <w:sectPr>

</xml_diff>